<commit_message>
Remove table, replace with paragraph styles; use darker color for headings
</commit_message>
<xml_diff>
--- a/docassemble/MAPetitionToSealEviction/data/templates/petition_to_seal_eviction_next_steps.docx
+++ b/docassemble/MAPetitionToSealEviction/data/templates/petition_to_seal_eviction_next_steps.docx
@@ -1,62 +1,19 @@
 
 <file path=word/document.xml><?xml version="1.0" encoding="utf-8"?>
 <w:document xmlns:wpc="http://schemas.microsoft.com/office/word/2010/wordprocessingCanvas" xmlns:cx="http://schemas.microsoft.com/office/drawing/2014/chartex" xmlns:cx1="http://schemas.microsoft.com/office/drawing/2015/9/8/chartex" xmlns:cx2="http://schemas.microsoft.com/office/drawing/2015/10/21/chartex" xmlns:cx3="http://schemas.microsoft.com/office/drawing/2016/5/9/chartex" xmlns:cx4="http://schemas.microsoft.com/office/drawing/2016/5/10/chartex" xmlns:cx5="http://schemas.microsoft.com/office/drawing/2016/5/11/chartex" xmlns:cx6="http://schemas.microsoft.com/office/drawing/2016/5/12/chartex" xmlns:cx7="http://schemas.microsoft.com/office/drawing/2016/5/13/chartex" xmlns:cx8="http://schemas.microsoft.com/office/drawing/2016/5/14/chartex" xmlns:mc="http://schemas.openxmlformats.org/markup-compatibility/2006" xmlns:aink="http://schemas.microsoft.com/office/drawing/2016/ink" xmlns:am3d="http://schemas.microsoft.com/office/drawing/2017/model3d" xmlns:o="urn:schemas-microsoft-com:office:office" xmlns:oel="http://schemas.microsoft.com/office/2019/extlst" xmlns:r="http://schemas.openxmlformats.org/officeDocument/2006/relationships" xmlns:m="http://schemas.openxmlformats.org/officeDocument/2006/math" xmlns:v="urn:schemas-microsoft-com:vml" xmlns:wp14="http://schemas.microsoft.com/office/word/2010/wordprocessingDrawing" xmlns:wp="http://schemas.openxmlformats.org/drawingml/2006/wordprocessingDrawing" xmlns:w10="urn:schemas-microsoft-com:office:word" xmlns:w="http://schemas.openxmlformats.org/wordprocessingml/2006/main" xmlns:w14="http://schemas.microsoft.com/office/word/2010/wordml" xmlns:w15="http://schemas.microsoft.com/office/word/2012/wordml" xmlns:w16cex="http://schemas.microsoft.com/office/word/2018/wordml/cex" xmlns:w16cid="http://schemas.microsoft.com/office/word/2016/wordml/cid" xmlns:w16="http://schemas.microsoft.com/office/word/2018/wordml" xmlns:w16du="http://schemas.microsoft.com/office/word/2023/wordml/word16du" xmlns:w16sdtdh="http://schemas.microsoft.com/office/word/2020/wordml/sdtdatahash" xmlns:w16sdtfl="http://schemas.microsoft.com/office/word/2024/wordml/sdtformatlock" xmlns:w16se="http://schemas.microsoft.com/office/word/2015/wordml/symex" xmlns:wpg="http://schemas.microsoft.com/office/word/2010/wordprocessingGroup" xmlns:wpi="http://schemas.microsoft.com/office/word/2010/wordprocessingInk" xmlns:wne="http://schemas.microsoft.com/office/word/2006/wordml" xmlns:wps="http://schemas.microsoft.com/office/word/2010/wordprocessingShape" mc:Ignorable="w14 w15 w16se w16cid w16 w16cex w16sdtdh w16sdtfl w16du wp14">
-  <w:background w:color="FFFFFF"/>
   <w:body>
-    <w:tbl>
-      <w:tblPr>
-        <w:tblStyle w:val="TableGrid"/>
-        <w:tblW w:w="10790" w:type="dxa"/>
-        <w:tblCellMar>
-          <w:top w:w="115" w:type="dxa"/>
-          <w:left w:w="115" w:type="dxa"/>
-          <w:bottom w:w="115" w:type="dxa"/>
-          <w:right w:w="115" w:type="dxa"/>
-        </w:tblCellMar>
-        <w:tblLook w:val="04A0" w:firstRow="1" w:lastRow="0" w:firstColumn="1" w:lastColumn="0" w:noHBand="0" w:noVBand="1"/>
-      </w:tblPr>
-      <w:tblGrid>
-        <w:gridCol w:w="10790"/>
-      </w:tblGrid>
-      <w:tr>
-        <w:tc>
-          <w:tcPr>
-            <w:tcW w:w="10790" w:type="dxa"/>
-            <w:shd w:val="clear" w:color="auto" w:fill="17406D" w:themeFill="text2"/>
-          </w:tcPr>
-          <w:p>
-            <w:pPr>
-              <w:pStyle w:val="Title"/>
-              <w:spacing w:after="0"/>
-              <w:jc w:val="center"/>
-            </w:pPr>
-            <w:r>
-              <w:rPr>
-                <w:color w:val="FFFFFF" w:themeColor="background1"/>
-              </w:rPr>
-              <w:t>File a Petition to Seal an Eviction</w:t>
-            </w:r>
-          </w:p>
-        </w:tc>
-      </w:tr>
-    </w:tbl>
     <w:p>
       <w:pPr>
-        <w:rPr>
-          <w:b/>
-          <w:bCs/>
-        </w:rPr>
-      </w:pPr>
+        <w:pStyle w:val="Title"/>
+        <w:jc w:val="center"/>
+      </w:pPr>
+      <w:r>
+        <w:t>File a Petition to Seal an Eviction</w:t>
+      </w:r>
     </w:p>
     <w:p>
       <w:pPr>
         <w:sectPr>
-          <w:headerReference w:type="even" r:id="rId10"/>
-          <w:headerReference w:type="default" r:id="rId11"/>
-          <w:footerReference w:type="even" r:id="rId12"/>
-          <w:footerReference w:type="default" r:id="rId13"/>
-          <w:headerReference w:type="first" r:id="rId14"/>
-          <w:footerReference w:type="first" r:id="rId15"/>
           <w:pgSz w:w="12240" w:h="15840"/>
           <w:pgMar w:top="720" w:right="720" w:bottom="720" w:left="720" w:header="0" w:footer="0" w:gutter="0"/>
           <w:pgNumType w:start="1"/>
@@ -98,9 +55,6 @@
       <w:bookmarkStart w:id="0" w:name="_yntzxzfdh9ya"/>
       <w:bookmarkEnd w:id="0"/>
       <w:r>
-        <w:rPr>
-          <w:lang w:val="en-US"/>
-        </w:rPr>
         <w:t>Next steps</w:t>
       </w:r>
     </w:p>
@@ -179,6 +133,7 @@
         </w:rPr>
         <w:t xml:space="preserve">{%p if </w:t>
       </w:r>
+      <w:proofErr w:type="spellStart"/>
       <w:r>
         <w:rPr>
           <w14:textOutline w14:w="9525" w14:cap="rnd" w14:cmpd="sng" w14:algn="ctr">
@@ -187,7 +142,18 @@
             <w14:bevel/>
           </w14:textOutline>
         </w:rPr>
-        <w:t>notice_required:</w:t>
+        <w:t>notice_required</w:t>
+      </w:r>
+      <w:proofErr w:type="spellEnd"/>
+      <w:r>
+        <w:rPr>
+          <w14:textOutline w14:w="9525" w14:cap="rnd" w14:cmpd="sng" w14:algn="ctr">
+            <w14:noFill/>
+            <w14:prstDash w14:val="solid"/>
+            <w14:bevel/>
+          </w14:textOutline>
+        </w:rPr>
+        <w:t>:</w:t>
       </w:r>
       <w:r>
         <w:rPr>
@@ -218,7 +184,55 @@
             <w14:bevel/>
           </w14:textOutline>
         </w:rPr>
-        <w:t>Deliver a copy to {{ showifdef('other_parties[0]') }}</w:t>
+        <w:t xml:space="preserve">Deliver a copy to {{ </w:t>
+      </w:r>
+      <w:proofErr w:type="spellStart"/>
+      <w:r>
+        <w:rPr>
+          <w:lang w:val="en-US"/>
+          <w14:textOutline w14:w="9525" w14:cap="rnd" w14:cmpd="sng" w14:algn="ctr">
+            <w14:noFill/>
+            <w14:prstDash w14:val="solid"/>
+            <w14:bevel/>
+          </w14:textOutline>
+        </w:rPr>
+        <w:t>showifdef</w:t>
+      </w:r>
+      <w:proofErr w:type="spellEnd"/>
+      <w:r>
+        <w:rPr>
+          <w:lang w:val="en-US"/>
+          <w14:textOutline w14:w="9525" w14:cap="rnd" w14:cmpd="sng" w14:algn="ctr">
+            <w14:noFill/>
+            <w14:prstDash w14:val="solid"/>
+            <w14:bevel/>
+          </w14:textOutline>
+        </w:rPr>
+        <w:t>('</w:t>
+      </w:r>
+      <w:proofErr w:type="spellStart"/>
+      <w:r>
+        <w:rPr>
+          <w:lang w:val="en-US"/>
+          <w14:textOutline w14:w="9525" w14:cap="rnd" w14:cmpd="sng" w14:algn="ctr">
+            <w14:noFill/>
+            <w14:prstDash w14:val="solid"/>
+            <w14:bevel/>
+          </w14:textOutline>
+        </w:rPr>
+        <w:t>other_parties</w:t>
+      </w:r>
+      <w:proofErr w:type="spellEnd"/>
+      <w:r>
+        <w:rPr>
+          <w:lang w:val="en-US"/>
+          <w14:textOutline w14:w="9525" w14:cap="rnd" w14:cmpd="sng" w14:algn="ctr">
+            <w14:noFill/>
+            <w14:prstDash w14:val="solid"/>
+            <w14:bevel/>
+          </w14:textOutline>
+        </w:rPr>
+        <w:t>[0]') }}</w:t>
       </w:r>
       <w:r>
         <w:rPr>
@@ -418,7 +432,35 @@
         <w:rPr>
           <w:lang w:val="en-US"/>
         </w:rPr>
-        <w:t>{%p if showifdef(“efile”) %}</w:t>
+        <w:t xml:space="preserve">{%p if </w:t>
+      </w:r>
+      <w:proofErr w:type="spellStart"/>
+      <w:r>
+        <w:rPr>
+          <w:lang w:val="en-US"/>
+        </w:rPr>
+        <w:t>showifdef</w:t>
+      </w:r>
+      <w:proofErr w:type="spellEnd"/>
+      <w:r>
+        <w:rPr>
+          <w:lang w:val="en-US"/>
+        </w:rPr>
+        <w:t>(“</w:t>
+      </w:r>
+      <w:proofErr w:type="spellStart"/>
+      <w:r>
+        <w:rPr>
+          <w:lang w:val="en-US"/>
+        </w:rPr>
+        <w:t>efile</w:t>
+      </w:r>
+      <w:proofErr w:type="spellEnd"/>
+      <w:r>
+        <w:rPr>
+          <w:lang w:val="en-US"/>
+        </w:rPr>
+        <w:t>”) %}</w:t>
       </w:r>
     </w:p>
     <w:p>
@@ -443,12 +485,14 @@
         </w:rPr>
         <w:t xml:space="preserve">regularly check the email address that you e-filed with, {{ </w:t>
       </w:r>
+      <w:proofErr w:type="spellStart"/>
       <w:r>
         <w:rPr>
           <w:lang w:val="en-US"/>
         </w:rPr>
         <w:t>my_username</w:t>
       </w:r>
+      <w:proofErr w:type="spellEnd"/>
       <w:r>
         <w:rPr>
           <w:lang w:val="en-US"/>
@@ -502,7 +546,35 @@
         <w:rPr>
           <w:lang w:val="en-US"/>
         </w:rPr>
-        <w:t>{%p if not showifdef(“efile”) %}</w:t>
+        <w:t xml:space="preserve">{%p if not </w:t>
+      </w:r>
+      <w:proofErr w:type="spellStart"/>
+      <w:r>
+        <w:rPr>
+          <w:lang w:val="en-US"/>
+        </w:rPr>
+        <w:t>showifdef</w:t>
+      </w:r>
+      <w:proofErr w:type="spellEnd"/>
+      <w:r>
+        <w:rPr>
+          <w:lang w:val="en-US"/>
+        </w:rPr>
+        <w:t>(“</w:t>
+      </w:r>
+      <w:proofErr w:type="spellStart"/>
+      <w:r>
+        <w:rPr>
+          <w:lang w:val="en-US"/>
+        </w:rPr>
+        <w:t>efile</w:t>
+      </w:r>
+      <w:proofErr w:type="spellEnd"/>
+      <w:r>
+        <w:rPr>
+          <w:lang w:val="en-US"/>
+        </w:rPr>
+        <w:t>”) %}</w:t>
       </w:r>
     </w:p>
     <w:p>
@@ -546,7 +618,15 @@
         <w:t xml:space="preserve">Deliver or mail your petition to </w:t>
       </w:r>
       <w:r>
-        <w:t>{{ trial_court }}</w:t>
+        <w:t xml:space="preserve">{{ </w:t>
+      </w:r>
+      <w:proofErr w:type="spellStart"/>
+      <w:r>
+        <w:t>trial_court</w:t>
+      </w:r>
+      <w:proofErr w:type="spellEnd"/>
+      <w:r>
+        <w:t xml:space="preserve"> }}</w:t>
       </w:r>
       <w:r>
         <w:t>.</w:t>
@@ -576,7 +656,21 @@
         <w:rPr>
           <w:lang w:val="en-US"/>
         </w:rPr>
-        <w:t xml:space="preserve"> if defined('trial_court.address.address') </w:t>
+        <w:t xml:space="preserve"> if defined('</w:t>
+      </w:r>
+      <w:proofErr w:type="spellStart"/>
+      <w:r>
+        <w:rPr>
+          <w:lang w:val="en-US"/>
+        </w:rPr>
+        <w:t>trial_court.address.address</w:t>
+      </w:r>
+      <w:proofErr w:type="spellEnd"/>
+      <w:r>
+        <w:rPr>
+          <w:lang w:val="en-US"/>
+        </w:rPr>
+        <w:t xml:space="preserve">') </w:t>
       </w:r>
       <w:r>
         <w:rPr>
@@ -610,11 +704,19 @@
         </w:rPr>
         <w:t xml:space="preserve">{{ </w:t>
       </w:r>
-      <w:r>
-        <w:rPr>
-          <w:lang w:val="en-US"/>
-        </w:rPr>
-        <w:t xml:space="preserve">trial_court.address.on_one_line() </w:t>
+      <w:proofErr w:type="spellStart"/>
+      <w:r>
+        <w:rPr>
+          <w:lang w:val="en-US"/>
+        </w:rPr>
+        <w:t>trial_court.address.on_one_line</w:t>
+      </w:r>
+      <w:proofErr w:type="spellEnd"/>
+      <w:r>
+        <w:rPr>
+          <w:lang w:val="en-US"/>
+        </w:rPr>
+        <w:t xml:space="preserve">() </w:t>
       </w:r>
       <w:r>
         <w:rPr>
@@ -1079,36 +1181,6 @@
 </w:endnotes>
 </file>
 
-<file path=word/footer1.xml><?xml version="1.0" encoding="utf-8"?>
-<w:ftr xmlns:wpc="http://schemas.microsoft.com/office/word/2010/wordprocessingCanvas" xmlns:cx="http://schemas.microsoft.com/office/drawing/2014/chartex" xmlns:cx1="http://schemas.microsoft.com/office/drawing/2015/9/8/chartex" xmlns:cx2="http://schemas.microsoft.com/office/drawing/2015/10/21/chartex" xmlns:cx3="http://schemas.microsoft.com/office/drawing/2016/5/9/chartex" xmlns:cx4="http://schemas.microsoft.com/office/drawing/2016/5/10/chartex" xmlns:cx5="http://schemas.microsoft.com/office/drawing/2016/5/11/chartex" xmlns:cx6="http://schemas.microsoft.com/office/drawing/2016/5/12/chartex" xmlns:cx7="http://schemas.microsoft.com/office/drawing/2016/5/13/chartex" xmlns:cx8="http://schemas.microsoft.com/office/drawing/2016/5/14/chartex" xmlns:mc="http://schemas.openxmlformats.org/markup-compatibility/2006" xmlns:aink="http://schemas.microsoft.com/office/drawing/2016/ink" xmlns:am3d="http://schemas.microsoft.com/office/drawing/2017/model3d" xmlns:o="urn:schemas-microsoft-com:office:office" xmlns:oel="http://schemas.microsoft.com/office/2019/extlst" xmlns:r="http://schemas.openxmlformats.org/officeDocument/2006/relationships" xmlns:m="http://schemas.openxmlformats.org/officeDocument/2006/math" xmlns:v="urn:schemas-microsoft-com:vml" xmlns:wp14="http://schemas.microsoft.com/office/word/2010/wordprocessingDrawing" xmlns:wp="http://schemas.openxmlformats.org/drawingml/2006/wordprocessingDrawing" xmlns:w10="urn:schemas-microsoft-com:office:word" xmlns:w="http://schemas.openxmlformats.org/wordprocessingml/2006/main" xmlns:w14="http://schemas.microsoft.com/office/word/2010/wordml" xmlns:w15="http://schemas.microsoft.com/office/word/2012/wordml" xmlns:w16cex="http://schemas.microsoft.com/office/word/2018/wordml/cex" xmlns:w16cid="http://schemas.microsoft.com/office/word/2016/wordml/cid" xmlns:w16="http://schemas.microsoft.com/office/word/2018/wordml" xmlns:w16du="http://schemas.microsoft.com/office/word/2023/wordml/word16du" xmlns:w16sdtdh="http://schemas.microsoft.com/office/word/2020/wordml/sdtdatahash" xmlns:w16sdtfl="http://schemas.microsoft.com/office/word/2024/wordml/sdtformatlock" xmlns:w16se="http://schemas.microsoft.com/office/word/2015/wordml/symex" xmlns:wpg="http://schemas.microsoft.com/office/word/2010/wordprocessingGroup" xmlns:wpi="http://schemas.microsoft.com/office/word/2010/wordprocessingInk" xmlns:wne="http://schemas.microsoft.com/office/word/2006/wordml" xmlns:wps="http://schemas.microsoft.com/office/word/2010/wordprocessingShape" mc:Ignorable="w14 w15 w16se w16cid w16 w16cex w16sdtdh w16sdtfl w16du wp14">
-  <w:p>
-    <w:pPr>
-      <w:pStyle w:val="Footer"/>
-    </w:pPr>
-  </w:p>
-</w:ftr>
-</file>
-
-<file path=word/footer2.xml><?xml version="1.0" encoding="utf-8"?>
-<w:ftr xmlns:wpc="http://schemas.microsoft.com/office/word/2010/wordprocessingCanvas" xmlns:cx="http://schemas.microsoft.com/office/drawing/2014/chartex" xmlns:cx1="http://schemas.microsoft.com/office/drawing/2015/9/8/chartex" xmlns:cx2="http://schemas.microsoft.com/office/drawing/2015/10/21/chartex" xmlns:cx3="http://schemas.microsoft.com/office/drawing/2016/5/9/chartex" xmlns:cx4="http://schemas.microsoft.com/office/drawing/2016/5/10/chartex" xmlns:cx5="http://schemas.microsoft.com/office/drawing/2016/5/11/chartex" xmlns:cx6="http://schemas.microsoft.com/office/drawing/2016/5/12/chartex" xmlns:cx7="http://schemas.microsoft.com/office/drawing/2016/5/13/chartex" xmlns:cx8="http://schemas.microsoft.com/office/drawing/2016/5/14/chartex" xmlns:mc="http://schemas.openxmlformats.org/markup-compatibility/2006" xmlns:aink="http://schemas.microsoft.com/office/drawing/2016/ink" xmlns:am3d="http://schemas.microsoft.com/office/drawing/2017/model3d" xmlns:o="urn:schemas-microsoft-com:office:office" xmlns:oel="http://schemas.microsoft.com/office/2019/extlst" xmlns:r="http://schemas.openxmlformats.org/officeDocument/2006/relationships" xmlns:m="http://schemas.openxmlformats.org/officeDocument/2006/math" xmlns:v="urn:schemas-microsoft-com:vml" xmlns:wp14="http://schemas.microsoft.com/office/word/2010/wordprocessingDrawing" xmlns:wp="http://schemas.openxmlformats.org/drawingml/2006/wordprocessingDrawing" xmlns:w10="urn:schemas-microsoft-com:office:word" xmlns:w="http://schemas.openxmlformats.org/wordprocessingml/2006/main" xmlns:w14="http://schemas.microsoft.com/office/word/2010/wordml" xmlns:w15="http://schemas.microsoft.com/office/word/2012/wordml" xmlns:w16cex="http://schemas.microsoft.com/office/word/2018/wordml/cex" xmlns:w16cid="http://schemas.microsoft.com/office/word/2016/wordml/cid" xmlns:w16="http://schemas.microsoft.com/office/word/2018/wordml" xmlns:w16du="http://schemas.microsoft.com/office/word/2023/wordml/word16du" xmlns:w16sdtdh="http://schemas.microsoft.com/office/word/2020/wordml/sdtdatahash" xmlns:w16sdtfl="http://schemas.microsoft.com/office/word/2024/wordml/sdtformatlock" xmlns:w16se="http://schemas.microsoft.com/office/word/2015/wordml/symex" xmlns:wpg="http://schemas.microsoft.com/office/word/2010/wordprocessingGroup" xmlns:wpi="http://schemas.microsoft.com/office/word/2010/wordprocessingInk" xmlns:wne="http://schemas.microsoft.com/office/word/2006/wordml" xmlns:wps="http://schemas.microsoft.com/office/word/2010/wordprocessingShape" mc:Ignorable="w14 w15 w16se w16cid w16 w16cex w16sdtdh w16sdtfl w16du wp14">
-  <w:p>
-    <w:pPr>
-      <w:pStyle w:val="Footer"/>
-    </w:pPr>
-  </w:p>
-</w:ftr>
-</file>
-
-<file path=word/footer3.xml><?xml version="1.0" encoding="utf-8"?>
-<w:ftr xmlns:wpc="http://schemas.microsoft.com/office/word/2010/wordprocessingCanvas" xmlns:cx="http://schemas.microsoft.com/office/drawing/2014/chartex" xmlns:cx1="http://schemas.microsoft.com/office/drawing/2015/9/8/chartex" xmlns:cx2="http://schemas.microsoft.com/office/drawing/2015/10/21/chartex" xmlns:cx3="http://schemas.microsoft.com/office/drawing/2016/5/9/chartex" xmlns:cx4="http://schemas.microsoft.com/office/drawing/2016/5/10/chartex" xmlns:cx5="http://schemas.microsoft.com/office/drawing/2016/5/11/chartex" xmlns:cx6="http://schemas.microsoft.com/office/drawing/2016/5/12/chartex" xmlns:cx7="http://schemas.microsoft.com/office/drawing/2016/5/13/chartex" xmlns:cx8="http://schemas.microsoft.com/office/drawing/2016/5/14/chartex" xmlns:mc="http://schemas.openxmlformats.org/markup-compatibility/2006" xmlns:aink="http://schemas.microsoft.com/office/drawing/2016/ink" xmlns:am3d="http://schemas.microsoft.com/office/drawing/2017/model3d" xmlns:o="urn:schemas-microsoft-com:office:office" xmlns:oel="http://schemas.microsoft.com/office/2019/extlst" xmlns:r="http://schemas.openxmlformats.org/officeDocument/2006/relationships" xmlns:m="http://schemas.openxmlformats.org/officeDocument/2006/math" xmlns:v="urn:schemas-microsoft-com:vml" xmlns:wp14="http://schemas.microsoft.com/office/word/2010/wordprocessingDrawing" xmlns:wp="http://schemas.openxmlformats.org/drawingml/2006/wordprocessingDrawing" xmlns:w10="urn:schemas-microsoft-com:office:word" xmlns:w="http://schemas.openxmlformats.org/wordprocessingml/2006/main" xmlns:w14="http://schemas.microsoft.com/office/word/2010/wordml" xmlns:w15="http://schemas.microsoft.com/office/word/2012/wordml" xmlns:w16cex="http://schemas.microsoft.com/office/word/2018/wordml/cex" xmlns:w16cid="http://schemas.microsoft.com/office/word/2016/wordml/cid" xmlns:w16="http://schemas.microsoft.com/office/word/2018/wordml" xmlns:w16du="http://schemas.microsoft.com/office/word/2023/wordml/word16du" xmlns:w16sdtdh="http://schemas.microsoft.com/office/word/2020/wordml/sdtdatahash" xmlns:w16sdtfl="http://schemas.microsoft.com/office/word/2024/wordml/sdtformatlock" xmlns:w16se="http://schemas.microsoft.com/office/word/2015/wordml/symex" xmlns:wpg="http://schemas.microsoft.com/office/word/2010/wordprocessingGroup" xmlns:wpi="http://schemas.microsoft.com/office/word/2010/wordprocessingInk" xmlns:wne="http://schemas.microsoft.com/office/word/2006/wordml" xmlns:wps="http://schemas.microsoft.com/office/word/2010/wordprocessingShape" mc:Ignorable="w14 w15 w16se w16cid w16 w16cex w16sdtdh w16sdtfl w16du wp14">
-  <w:p>
-    <w:pPr>
-      <w:pStyle w:val="Footer"/>
-    </w:pPr>
-  </w:p>
-</w:ftr>
-</file>
-
 <file path=word/footnotes.xml><?xml version="1.0" encoding="utf-8"?>
 <w:footnotes xmlns:wpc="http://schemas.microsoft.com/office/word/2010/wordprocessingCanvas" xmlns:cx="http://schemas.microsoft.com/office/drawing/2014/chartex" xmlns:cx1="http://schemas.microsoft.com/office/drawing/2015/9/8/chartex" xmlns:cx2="http://schemas.microsoft.com/office/drawing/2015/10/21/chartex" xmlns:cx3="http://schemas.microsoft.com/office/drawing/2016/5/9/chartex" xmlns:cx4="http://schemas.microsoft.com/office/drawing/2016/5/10/chartex" xmlns:cx5="http://schemas.microsoft.com/office/drawing/2016/5/11/chartex" xmlns:cx6="http://schemas.microsoft.com/office/drawing/2016/5/12/chartex" xmlns:cx7="http://schemas.microsoft.com/office/drawing/2016/5/13/chartex" xmlns:cx8="http://schemas.microsoft.com/office/drawing/2016/5/14/chartex" xmlns:mc="http://schemas.openxmlformats.org/markup-compatibility/2006" xmlns:aink="http://schemas.microsoft.com/office/drawing/2016/ink" xmlns:am3d="http://schemas.microsoft.com/office/drawing/2017/model3d" xmlns:o="urn:schemas-microsoft-com:office:office" xmlns:oel="http://schemas.microsoft.com/office/2019/extlst" xmlns:r="http://schemas.openxmlformats.org/officeDocument/2006/relationships" xmlns:m="http://schemas.openxmlformats.org/officeDocument/2006/math" xmlns:v="urn:schemas-microsoft-com:vml" xmlns:wp14="http://schemas.microsoft.com/office/word/2010/wordprocessingDrawing" xmlns:wp="http://schemas.openxmlformats.org/drawingml/2006/wordprocessingDrawing" xmlns:w10="urn:schemas-microsoft-com:office:word" xmlns:w="http://schemas.openxmlformats.org/wordprocessingml/2006/main" xmlns:w14="http://schemas.microsoft.com/office/word/2010/wordml" xmlns:w15="http://schemas.microsoft.com/office/word/2012/wordml" xmlns:w16cex="http://schemas.microsoft.com/office/word/2018/wordml/cex" xmlns:w16cid="http://schemas.microsoft.com/office/word/2016/wordml/cid" xmlns:w16="http://schemas.microsoft.com/office/word/2018/wordml" xmlns:w16du="http://schemas.microsoft.com/office/word/2023/wordml/word16du" xmlns:w16sdtdh="http://schemas.microsoft.com/office/word/2020/wordml/sdtdatahash" xmlns:w16sdtfl="http://schemas.microsoft.com/office/word/2024/wordml/sdtformatlock" xmlns:w16se="http://schemas.microsoft.com/office/word/2015/wordml/symex" xmlns:wpg="http://schemas.microsoft.com/office/word/2010/wordprocessingGroup" xmlns:wpi="http://schemas.microsoft.com/office/word/2010/wordprocessingInk" xmlns:wne="http://schemas.microsoft.com/office/word/2006/wordml" xmlns:wps="http://schemas.microsoft.com/office/word/2010/wordprocessingShape" mc:Ignorable="w14 w15 w16se w16cid w16 w16cex w16sdtdh w16sdtfl w16du wp14">
   <w:footnote w:type="separator" w:id="-1">
@@ -1132,36 +1204,6 @@
     </w:p>
   </w:footnote>
 </w:footnotes>
-</file>
-
-<file path=word/header1.xml><?xml version="1.0" encoding="utf-8"?>
-<w:hdr xmlns:wpc="http://schemas.microsoft.com/office/word/2010/wordprocessingCanvas" xmlns:cx="http://schemas.microsoft.com/office/drawing/2014/chartex" xmlns:cx1="http://schemas.microsoft.com/office/drawing/2015/9/8/chartex" xmlns:cx2="http://schemas.microsoft.com/office/drawing/2015/10/21/chartex" xmlns:cx3="http://schemas.microsoft.com/office/drawing/2016/5/9/chartex" xmlns:cx4="http://schemas.microsoft.com/office/drawing/2016/5/10/chartex" xmlns:cx5="http://schemas.microsoft.com/office/drawing/2016/5/11/chartex" xmlns:cx6="http://schemas.microsoft.com/office/drawing/2016/5/12/chartex" xmlns:cx7="http://schemas.microsoft.com/office/drawing/2016/5/13/chartex" xmlns:cx8="http://schemas.microsoft.com/office/drawing/2016/5/14/chartex" xmlns:mc="http://schemas.openxmlformats.org/markup-compatibility/2006" xmlns:aink="http://schemas.microsoft.com/office/drawing/2016/ink" xmlns:am3d="http://schemas.microsoft.com/office/drawing/2017/model3d" xmlns:o="urn:schemas-microsoft-com:office:office" xmlns:oel="http://schemas.microsoft.com/office/2019/extlst" xmlns:r="http://schemas.openxmlformats.org/officeDocument/2006/relationships" xmlns:m="http://schemas.openxmlformats.org/officeDocument/2006/math" xmlns:v="urn:schemas-microsoft-com:vml" xmlns:wp14="http://schemas.microsoft.com/office/word/2010/wordprocessingDrawing" xmlns:wp="http://schemas.openxmlformats.org/drawingml/2006/wordprocessingDrawing" xmlns:w10="urn:schemas-microsoft-com:office:word" xmlns:w="http://schemas.openxmlformats.org/wordprocessingml/2006/main" xmlns:w14="http://schemas.microsoft.com/office/word/2010/wordml" xmlns:w15="http://schemas.microsoft.com/office/word/2012/wordml" xmlns:w16cex="http://schemas.microsoft.com/office/word/2018/wordml/cex" xmlns:w16cid="http://schemas.microsoft.com/office/word/2016/wordml/cid" xmlns:w16="http://schemas.microsoft.com/office/word/2018/wordml" xmlns:w16du="http://schemas.microsoft.com/office/word/2023/wordml/word16du" xmlns:w16sdtdh="http://schemas.microsoft.com/office/word/2020/wordml/sdtdatahash" xmlns:w16sdtfl="http://schemas.microsoft.com/office/word/2024/wordml/sdtformatlock" xmlns:w16se="http://schemas.microsoft.com/office/word/2015/wordml/symex" xmlns:wpg="http://schemas.microsoft.com/office/word/2010/wordprocessingGroup" xmlns:wpi="http://schemas.microsoft.com/office/word/2010/wordprocessingInk" xmlns:wne="http://schemas.microsoft.com/office/word/2006/wordml" xmlns:wps="http://schemas.microsoft.com/office/word/2010/wordprocessingShape" mc:Ignorable="w14 w15 w16se w16cid w16 w16cex w16sdtdh w16sdtfl w16du wp14">
-  <w:p>
-    <w:pPr>
-      <w:pStyle w:val="Header"/>
-    </w:pPr>
-  </w:p>
-</w:hdr>
-</file>
-
-<file path=word/header2.xml><?xml version="1.0" encoding="utf-8"?>
-<w:hdr xmlns:wpc="http://schemas.microsoft.com/office/word/2010/wordprocessingCanvas" xmlns:cx="http://schemas.microsoft.com/office/drawing/2014/chartex" xmlns:cx1="http://schemas.microsoft.com/office/drawing/2015/9/8/chartex" xmlns:cx2="http://schemas.microsoft.com/office/drawing/2015/10/21/chartex" xmlns:cx3="http://schemas.microsoft.com/office/drawing/2016/5/9/chartex" xmlns:cx4="http://schemas.microsoft.com/office/drawing/2016/5/10/chartex" xmlns:cx5="http://schemas.microsoft.com/office/drawing/2016/5/11/chartex" xmlns:cx6="http://schemas.microsoft.com/office/drawing/2016/5/12/chartex" xmlns:cx7="http://schemas.microsoft.com/office/drawing/2016/5/13/chartex" xmlns:cx8="http://schemas.microsoft.com/office/drawing/2016/5/14/chartex" xmlns:mc="http://schemas.openxmlformats.org/markup-compatibility/2006" xmlns:aink="http://schemas.microsoft.com/office/drawing/2016/ink" xmlns:am3d="http://schemas.microsoft.com/office/drawing/2017/model3d" xmlns:o="urn:schemas-microsoft-com:office:office" xmlns:oel="http://schemas.microsoft.com/office/2019/extlst" xmlns:r="http://schemas.openxmlformats.org/officeDocument/2006/relationships" xmlns:m="http://schemas.openxmlformats.org/officeDocument/2006/math" xmlns:v="urn:schemas-microsoft-com:vml" xmlns:wp14="http://schemas.microsoft.com/office/word/2010/wordprocessingDrawing" xmlns:wp="http://schemas.openxmlformats.org/drawingml/2006/wordprocessingDrawing" xmlns:w10="urn:schemas-microsoft-com:office:word" xmlns:w="http://schemas.openxmlformats.org/wordprocessingml/2006/main" xmlns:w14="http://schemas.microsoft.com/office/word/2010/wordml" xmlns:w15="http://schemas.microsoft.com/office/word/2012/wordml" xmlns:w16cex="http://schemas.microsoft.com/office/word/2018/wordml/cex" xmlns:w16cid="http://schemas.microsoft.com/office/word/2016/wordml/cid" xmlns:w16="http://schemas.microsoft.com/office/word/2018/wordml" xmlns:w16du="http://schemas.microsoft.com/office/word/2023/wordml/word16du" xmlns:w16sdtdh="http://schemas.microsoft.com/office/word/2020/wordml/sdtdatahash" xmlns:w16sdtfl="http://schemas.microsoft.com/office/word/2024/wordml/sdtformatlock" xmlns:w16se="http://schemas.microsoft.com/office/word/2015/wordml/symex" xmlns:wpg="http://schemas.microsoft.com/office/word/2010/wordprocessingGroup" xmlns:wpi="http://schemas.microsoft.com/office/word/2010/wordprocessingInk" xmlns:wne="http://schemas.microsoft.com/office/word/2006/wordml" xmlns:wps="http://schemas.microsoft.com/office/word/2010/wordprocessingShape" mc:Ignorable="w14 w15 w16se w16cid w16 w16cex w16sdtdh w16sdtfl w16du wp14">
-  <w:p>
-    <w:pPr>
-      <w:pStyle w:val="Header"/>
-    </w:pPr>
-  </w:p>
-</w:hdr>
-</file>
-
-<file path=word/header3.xml><?xml version="1.0" encoding="utf-8"?>
-<w:hdr xmlns:wpc="http://schemas.microsoft.com/office/word/2010/wordprocessingCanvas" xmlns:cx="http://schemas.microsoft.com/office/drawing/2014/chartex" xmlns:cx1="http://schemas.microsoft.com/office/drawing/2015/9/8/chartex" xmlns:cx2="http://schemas.microsoft.com/office/drawing/2015/10/21/chartex" xmlns:cx3="http://schemas.microsoft.com/office/drawing/2016/5/9/chartex" xmlns:cx4="http://schemas.microsoft.com/office/drawing/2016/5/10/chartex" xmlns:cx5="http://schemas.microsoft.com/office/drawing/2016/5/11/chartex" xmlns:cx6="http://schemas.microsoft.com/office/drawing/2016/5/12/chartex" xmlns:cx7="http://schemas.microsoft.com/office/drawing/2016/5/13/chartex" xmlns:cx8="http://schemas.microsoft.com/office/drawing/2016/5/14/chartex" xmlns:mc="http://schemas.openxmlformats.org/markup-compatibility/2006" xmlns:aink="http://schemas.microsoft.com/office/drawing/2016/ink" xmlns:am3d="http://schemas.microsoft.com/office/drawing/2017/model3d" xmlns:o="urn:schemas-microsoft-com:office:office" xmlns:oel="http://schemas.microsoft.com/office/2019/extlst" xmlns:r="http://schemas.openxmlformats.org/officeDocument/2006/relationships" xmlns:m="http://schemas.openxmlformats.org/officeDocument/2006/math" xmlns:v="urn:schemas-microsoft-com:vml" xmlns:wp14="http://schemas.microsoft.com/office/word/2010/wordprocessingDrawing" xmlns:wp="http://schemas.openxmlformats.org/drawingml/2006/wordprocessingDrawing" xmlns:w10="urn:schemas-microsoft-com:office:word" xmlns:w="http://schemas.openxmlformats.org/wordprocessingml/2006/main" xmlns:w14="http://schemas.microsoft.com/office/word/2010/wordml" xmlns:w15="http://schemas.microsoft.com/office/word/2012/wordml" xmlns:w16cex="http://schemas.microsoft.com/office/word/2018/wordml/cex" xmlns:w16cid="http://schemas.microsoft.com/office/word/2016/wordml/cid" xmlns:w16="http://schemas.microsoft.com/office/word/2018/wordml" xmlns:w16du="http://schemas.microsoft.com/office/word/2023/wordml/word16du" xmlns:w16sdtdh="http://schemas.microsoft.com/office/word/2020/wordml/sdtdatahash" xmlns:w16sdtfl="http://schemas.microsoft.com/office/word/2024/wordml/sdtformatlock" xmlns:w16se="http://schemas.microsoft.com/office/word/2015/wordml/symex" xmlns:wpg="http://schemas.microsoft.com/office/word/2010/wordprocessingGroup" xmlns:wpi="http://schemas.microsoft.com/office/word/2010/wordprocessingInk" xmlns:wne="http://schemas.microsoft.com/office/word/2006/wordml" xmlns:wps="http://schemas.microsoft.com/office/word/2010/wordprocessingShape" mc:Ignorable="w14 w15 w16se w16cid w16 w16cex w16sdtdh w16sdtfl w16du wp14">
-  <w:p>
-    <w:pPr>
-      <w:pStyle w:val="Header"/>
-    </w:pPr>
-  </w:p>
-</w:hdr>
 </file>
 
 <file path=word/numbering.xml><?xml version="1.0" encoding="utf-8"?>
@@ -3514,11 +3556,11 @@
     <w:uiPriority w:val="9"/>
     <w:unhideWhenUsed/>
     <w:qFormat/>
-    <w:rsid w:val="00450815"/>
+    <w:rsid w:val="007C496D"/>
     <w:pPr>
       <w:keepNext/>
       <w:pBdr>
-        <w:bottom w:val="single" w:sz="12" w:space="3" w:color="0074F1"/>
+        <w:bottom w:val="single" w:sz="12" w:space="3" w:color="17406D" w:themeColor="text2"/>
       </w:pBdr>
       <w:spacing w:before="400" w:after="120"/>
       <w:outlineLvl w:val="1"/>
@@ -3527,7 +3569,7 @@
       <w:rFonts w:asciiTheme="majorHAnsi" w:eastAsiaTheme="majorEastAsia" w:hAnsiTheme="majorHAnsi" w:cstheme="majorBidi"/>
       <w:b/>
       <w:bCs/>
-      <w:color w:val="0074F1"/>
+      <w:color w:val="17406D" w:themeColor="text2"/>
       <w:sz w:val="24"/>
       <w:szCs w:val="24"/>
     </w:rPr>
@@ -3790,12 +3832,12 @@
     <w:link w:val="Heading2"/>
     <w:uiPriority w:val="9"/>
     <w:qFormat/>
-    <w:rsid w:val="00450815"/>
+    <w:rsid w:val="007C496D"/>
     <w:rPr>
       <w:rFonts w:asciiTheme="majorHAnsi" w:eastAsiaTheme="majorEastAsia" w:hAnsiTheme="majorHAnsi" w:cstheme="majorBidi"/>
       <w:b/>
       <w:bCs/>
-      <w:color w:val="0074F1"/>
+      <w:color w:val="17406D" w:themeColor="text2"/>
       <w:sz w:val="24"/>
       <w:szCs w:val="24"/>
     </w:rPr>
@@ -3920,15 +3962,16 @@
     <w:link w:val="Title"/>
     <w:uiPriority w:val="10"/>
     <w:qFormat/>
-    <w:rsid w:val="00F47A36"/>
+    <w:rsid w:val="002841FA"/>
     <w:rPr>
       <w:rFonts w:asciiTheme="majorHAnsi" w:eastAsiaTheme="majorEastAsia" w:hAnsiTheme="majorHAnsi" w:cstheme="majorBidi"/>
       <w:b/>
       <w:bCs/>
-      <w:color w:val="002E63"/>
+      <w:color w:val="FFFFFF" w:themeColor="background1"/>
       <w:spacing w:val="10"/>
       <w:sz w:val="36"/>
       <w:szCs w:val="36"/>
+      <w:shd w:val="clear" w:color="auto" w:fill="17406D" w:themeFill="text2"/>
     </w:rPr>
   </w:style>
   <w:style w:type="character" w:customStyle="1" w:styleId="SubtitleChar">
@@ -4145,12 +4188,19 @@
     <w:link w:val="TitleChar"/>
     <w:uiPriority w:val="10"/>
     <w:qFormat/>
-    <w:rsid w:val="00F47A36"/>
+    <w:rsid w:val="002841FA"/>
+    <w:pPr>
+      <w:pBdr>
+        <w:top w:val="single" w:sz="48" w:space="1" w:color="17406D" w:themeColor="text2"/>
+        <w:bottom w:val="single" w:sz="48" w:space="1" w:color="17406D" w:themeColor="text2"/>
+      </w:pBdr>
+      <w:shd w:val="clear" w:color="auto" w:fill="17406D" w:themeFill="text2"/>
+    </w:pPr>
     <w:rPr>
       <w:rFonts w:asciiTheme="majorHAnsi" w:eastAsiaTheme="majorEastAsia" w:hAnsiTheme="majorHAnsi" w:cstheme="majorBidi"/>
       <w:b/>
       <w:bCs/>
-      <w:color w:val="002E63"/>
+      <w:color w:val="FFFFFF" w:themeColor="background1"/>
       <w:spacing w:val="10"/>
       <w:sz w:val="36"/>
       <w:szCs w:val="36"/>
@@ -4690,6 +4740,17 @@
 </file>
 
 <file path=customXml/item1.xml><?xml version="1.0" encoding="utf-8"?>
+<p:properties xmlns:p="http://schemas.microsoft.com/office/2006/metadata/properties" xmlns:xsi="http://www.w3.org/2001/XMLSchema-instance" xmlns:pc="http://schemas.microsoft.com/office/infopath/2007/PartnerControls">
+  <documentManagement>
+    <TaxCatchAll xmlns="7dbd75cb-e23e-4bbb-9662-1ab6b6f3550b" xsi:nil="true"/>
+    <lcf76f155ced4ddcb4097134ff3c332f xmlns="dc24c30d-cbd4-4968-aaed-12d3995df8af">
+      <Terms xmlns="http://schemas.microsoft.com/office/infopath/2007/PartnerControls"/>
+    </lcf76f155ced4ddcb4097134ff3c332f>
+  </documentManagement>
+</p:properties>
+</file>
+
+<file path=customXml/item2.xml><?xml version="1.0" encoding="utf-8"?>
 <?mso-contentType ?>
 <FormTemplates xmlns="http://schemas.microsoft.com/sharepoint/v3/contenttype/forms">
   <Display>DocumentLibraryForm</Display>
@@ -4698,7 +4759,7 @@
 </FormTemplates>
 </file>
 
-<file path=customXml/item2.xml><?xml version="1.0" encoding="utf-8"?>
+<file path=customXml/item3.xml><?xml version="1.0" encoding="utf-8"?>
 <ct:contentTypeSchema xmlns:ct="http://schemas.microsoft.com/office/2006/metadata/contentType" xmlns:ma="http://schemas.microsoft.com/office/2006/metadata/properties/metaAttributes" ct:_="" ma:_="" ma:contentTypeName="Document" ma:contentTypeID="0x01010080965809FF228B4C891978F4CC8DB90B" ma:contentTypeVersion="12" ma:contentTypeDescription="Create a new document." ma:contentTypeScope="" ma:versionID="9c49eb4d28d16553f3e1beb1385723e7">
   <xsd:schema xmlns:xsd="http://www.w3.org/2001/XMLSchema" xmlns:xs="http://www.w3.org/2001/XMLSchema" xmlns:p="http://schemas.microsoft.com/office/2006/metadata/properties" xmlns:ns2="dc24c30d-cbd4-4968-aaed-12d3995df8af" xmlns:ns3="7dbd75cb-e23e-4bbb-9662-1ab6b6f3550b" targetNamespace="http://schemas.microsoft.com/office/2006/metadata/properties" ma:root="true" ma:fieldsID="ba6a862a070d9f6f71854b7f78b9bf81" ns2:_="" ns3:_="">
     <xsd:import namespace="dc24c30d-cbd4-4968-aaed-12d3995df8af"/>
@@ -4899,18 +4960,18 @@
 </ct:contentTypeSchema>
 </file>
 
-<file path=customXml/item3.xml><?xml version="1.0" encoding="utf-8"?>
-<p:properties xmlns:p="http://schemas.microsoft.com/office/2006/metadata/properties" xmlns:xsi="http://www.w3.org/2001/XMLSchema-instance" xmlns:pc="http://schemas.microsoft.com/office/infopath/2007/PartnerControls">
-  <documentManagement>
-    <TaxCatchAll xmlns="7dbd75cb-e23e-4bbb-9662-1ab6b6f3550b" xsi:nil="true"/>
-    <lcf76f155ced4ddcb4097134ff3c332f xmlns="dc24c30d-cbd4-4968-aaed-12d3995df8af">
-      <Terms xmlns="http://schemas.microsoft.com/office/infopath/2007/PartnerControls"/>
-    </lcf76f155ced4ddcb4097134ff3c332f>
-  </documentManagement>
-</p:properties>
+<file path=customXml/itemProps1.xml><?xml version="1.0" encoding="utf-8"?>
+<ds:datastoreItem xmlns:ds="http://schemas.openxmlformats.org/officeDocument/2006/customXml" ds:itemID="{6796437A-0DB8-4273-A275-D71E35AB8B0A}">
+  <ds:schemaRefs>
+    <ds:schemaRef ds:uri="http://schemas.microsoft.com/office/2006/metadata/properties"/>
+    <ds:schemaRef ds:uri="http://schemas.microsoft.com/office/infopath/2007/PartnerControls"/>
+    <ds:schemaRef ds:uri="7dbd75cb-e23e-4bbb-9662-1ab6b6f3550b"/>
+    <ds:schemaRef ds:uri="dc24c30d-cbd4-4968-aaed-12d3995df8af"/>
+  </ds:schemaRefs>
+</ds:datastoreItem>
 </file>
 
-<file path=customXml/itemProps1.xml><?xml version="1.0" encoding="utf-8"?>
+<file path=customXml/itemProps2.xml><?xml version="1.0" encoding="utf-8"?>
 <ds:datastoreItem xmlns:ds="http://schemas.openxmlformats.org/officeDocument/2006/customXml" ds:itemID="{1E505B68-5BE2-4F65-9D4E-7DC7DB12F4CC}">
   <ds:schemaRefs>
     <ds:schemaRef ds:uri="http://schemas.microsoft.com/sharepoint/v3/contenttype/forms"/>
@@ -4918,7 +4979,7 @@
 </ds:datastoreItem>
 </file>
 
-<file path=customXml/itemProps2.xml><?xml version="1.0" encoding="utf-8"?>
+<file path=customXml/itemProps3.xml><?xml version="1.0" encoding="utf-8"?>
 <ds:datastoreItem xmlns:ds="http://schemas.openxmlformats.org/officeDocument/2006/customXml" ds:itemID="{EAEE37D9-83C3-4836-B2B5-2E782AF650FD}">
   <ds:schemaRefs>
     <ds:schemaRef ds:uri="http://schemas.microsoft.com/office/2006/metadata/contentType"/>
@@ -4935,15 +4996,4 @@
     <ds:schemaRef ds:uri="http://schemas.microsoft.com/internal/obd"/>
   </ds:schemaRefs>
 </ds:datastoreItem>
-</file>
-
-<file path=customXml/itemProps3.xml><?xml version="1.0" encoding="utf-8"?>
-<ds:datastoreItem xmlns:ds="http://schemas.openxmlformats.org/officeDocument/2006/customXml" ds:itemID="{6796437A-0DB8-4273-A275-D71E35AB8B0A}">
-  <ds:schemaRefs>
-    <ds:schemaRef ds:uri="http://schemas.microsoft.com/office/2006/metadata/properties"/>
-    <ds:schemaRef ds:uri="http://schemas.microsoft.com/office/infopath/2007/PartnerControls"/>
-    <ds:schemaRef ds:uri="7dbd75cb-e23e-4bbb-9662-1ab6b6f3550b"/>
-    <ds:schemaRef ds:uri="dc24c30d-cbd4-4968-aaed-12d3995df8af"/>
-  </ds:schemaRefs>
-</ds:datastoreItem>
 </file>
</xml_diff>

<commit_message>
Somewhat better remediated PDF
</commit_message>
<xml_diff>
--- a/docassemble/MAPetitionToSealEviction/data/templates/petition_to_seal_eviction_next_steps.docx
+++ b/docassemble/MAPetitionToSealEviction/data/templates/petition_to_seal_eviction_next_steps.docx
@@ -9,6 +9,32 @@
       </w:pPr>
       <w:r>
         <w:t>File a Petition to Seal an Eviction</w:t>
+      </w:r>
+    </w:p>
+    <w:p>
+      <w:r>
+        <w:rPr>
+          <w:lang w:val="en-US"/>
+        </w:rPr>
+        <w:t xml:space="preserve">You have </w:t>
+      </w:r>
+      <w:r>
+        <w:rPr>
+          <w:lang w:val="en-US"/>
+        </w:rPr>
+        <w:t xml:space="preserve">completed </w:t>
+      </w:r>
+      <w:r>
+        <w:rPr>
+          <w:lang w:val="en-US"/>
+        </w:rPr>
+        <w:t xml:space="preserve">the Petition to Seal an Eviction. </w:t>
+      </w:r>
+      <w:r>
+        <w:rPr>
+          <w:lang w:val="en-US"/>
+        </w:rPr>
+        <w:t>Below you will find information on next steps and what to expect moving forward.</w:t>
       </w:r>
     </w:p>
     <w:p>
@@ -23,30 +49,6 @@
           <w:docGrid w:linePitch="326" w:charSpace="8192"/>
         </w:sectPr>
       </w:pPr>
-      <w:r>
-        <w:rPr>
-          <w:lang w:val="en-US"/>
-        </w:rPr>
-        <w:t xml:space="preserve">You have </w:t>
-      </w:r>
-      <w:r>
-        <w:rPr>
-          <w:lang w:val="en-US"/>
-        </w:rPr>
-        <w:t xml:space="preserve">completed </w:t>
-      </w:r>
-      <w:r>
-        <w:rPr>
-          <w:lang w:val="en-US"/>
-        </w:rPr>
-        <w:t xml:space="preserve">the Petition to Seal an Eviction. </w:t>
-      </w:r>
-      <w:r>
-        <w:rPr>
-          <w:lang w:val="en-US"/>
-        </w:rPr>
-        <w:t>Below you will find information on next steps and what to expect moving forward.</w:t>
-      </w:r>
     </w:p>
     <w:p>
       <w:pPr>
@@ -4339,7 +4341,6 @@
     <w:basedOn w:val="Heading1"/>
     <w:next w:val="Normal"/>
     <w:uiPriority w:val="39"/>
-    <w:semiHidden/>
     <w:unhideWhenUsed/>
     <w:qFormat/>
     <w:rsid w:val="00957D00"/>
@@ -4474,6 +4475,31 @@
       <w:color w:val="605E5C"/>
       <w:shd w:val="clear" w:color="auto" w:fill="E1DFDD"/>
     </w:rPr>
+  </w:style>
+  <w:style w:type="paragraph" w:styleId="TOC1">
+    <w:name w:val="toc 1"/>
+    <w:basedOn w:val="Normal"/>
+    <w:next w:val="Normal"/>
+    <w:autoRedefine/>
+    <w:uiPriority w:val="39"/>
+    <w:unhideWhenUsed/>
+    <w:rsid w:val="008756D7"/>
+    <w:pPr>
+      <w:spacing w:after="100"/>
+    </w:pPr>
+  </w:style>
+  <w:style w:type="paragraph" w:styleId="TOC2">
+    <w:name w:val="toc 2"/>
+    <w:basedOn w:val="Normal"/>
+    <w:next w:val="Normal"/>
+    <w:autoRedefine/>
+    <w:uiPriority w:val="39"/>
+    <w:unhideWhenUsed/>
+    <w:rsid w:val="008756D7"/>
+    <w:pPr>
+      <w:spacing w:after="100"/>
+      <w:ind w:left="200"/>
+    </w:pPr>
   </w:style>
 </w:styles>
 </file>
@@ -4740,26 +4766,6 @@
 </file>
 
 <file path=customXml/item1.xml><?xml version="1.0" encoding="utf-8"?>
-<p:properties xmlns:p="http://schemas.microsoft.com/office/2006/metadata/properties" xmlns:xsi="http://www.w3.org/2001/XMLSchema-instance" xmlns:pc="http://schemas.microsoft.com/office/infopath/2007/PartnerControls">
-  <documentManagement>
-    <TaxCatchAll xmlns="7dbd75cb-e23e-4bbb-9662-1ab6b6f3550b" xsi:nil="true"/>
-    <lcf76f155ced4ddcb4097134ff3c332f xmlns="dc24c30d-cbd4-4968-aaed-12d3995df8af">
-      <Terms xmlns="http://schemas.microsoft.com/office/infopath/2007/PartnerControls"/>
-    </lcf76f155ced4ddcb4097134ff3c332f>
-  </documentManagement>
-</p:properties>
-</file>
-
-<file path=customXml/item2.xml><?xml version="1.0" encoding="utf-8"?>
-<?mso-contentType ?>
-<FormTemplates xmlns="http://schemas.microsoft.com/sharepoint/v3/contenttype/forms">
-  <Display>DocumentLibraryForm</Display>
-  <Edit>DocumentLibraryForm</Edit>
-  <New>DocumentLibraryForm</New>
-</FormTemplates>
-</file>
-
-<file path=customXml/item3.xml><?xml version="1.0" encoding="utf-8"?>
 <ct:contentTypeSchema xmlns:ct="http://schemas.microsoft.com/office/2006/metadata/contentType" xmlns:ma="http://schemas.microsoft.com/office/2006/metadata/properties/metaAttributes" ct:_="" ma:_="" ma:contentTypeName="Document" ma:contentTypeID="0x01010080965809FF228B4C891978F4CC8DB90B" ma:contentTypeVersion="12" ma:contentTypeDescription="Create a new document." ma:contentTypeScope="" ma:versionID="9c49eb4d28d16553f3e1beb1385723e7">
   <xsd:schema xmlns:xsd="http://www.w3.org/2001/XMLSchema" xmlns:xs="http://www.w3.org/2001/XMLSchema" xmlns:p="http://schemas.microsoft.com/office/2006/metadata/properties" xmlns:ns2="dc24c30d-cbd4-4968-aaed-12d3995df8af" xmlns:ns3="7dbd75cb-e23e-4bbb-9662-1ab6b6f3550b" targetNamespace="http://schemas.microsoft.com/office/2006/metadata/properties" ma:root="true" ma:fieldsID="ba6a862a070d9f6f71854b7f78b9bf81" ns2:_="" ns3:_="">
     <xsd:import namespace="dc24c30d-cbd4-4968-aaed-12d3995df8af"/>
@@ -4960,26 +4966,31 @@
 </ct:contentTypeSchema>
 </file>
 
-<file path=customXml/itemProps1.xml><?xml version="1.0" encoding="utf-8"?>
-<ds:datastoreItem xmlns:ds="http://schemas.openxmlformats.org/officeDocument/2006/customXml" ds:itemID="{6796437A-0DB8-4273-A275-D71E35AB8B0A}">
-  <ds:schemaRefs>
-    <ds:schemaRef ds:uri="http://schemas.microsoft.com/office/2006/metadata/properties"/>
-    <ds:schemaRef ds:uri="http://schemas.microsoft.com/office/infopath/2007/PartnerControls"/>
-    <ds:schemaRef ds:uri="7dbd75cb-e23e-4bbb-9662-1ab6b6f3550b"/>
-    <ds:schemaRef ds:uri="dc24c30d-cbd4-4968-aaed-12d3995df8af"/>
-  </ds:schemaRefs>
-</ds:datastoreItem>
+<file path=customXml/item2.xml><?xml version="1.0" encoding="utf-8"?>
+<?mso-contentType ?>
+<FormTemplates xmlns="http://schemas.microsoft.com/sharepoint/v3/contenttype/forms">
+  <Display>DocumentLibraryForm</Display>
+  <Edit>DocumentLibraryForm</Edit>
+  <New>DocumentLibraryForm</New>
+</FormTemplates>
 </file>
 
-<file path=customXml/itemProps2.xml><?xml version="1.0" encoding="utf-8"?>
-<ds:datastoreItem xmlns:ds="http://schemas.openxmlformats.org/officeDocument/2006/customXml" ds:itemID="{1E505B68-5BE2-4F65-9D4E-7DC7DB12F4CC}">
-  <ds:schemaRefs>
-    <ds:schemaRef ds:uri="http://schemas.microsoft.com/sharepoint/v3/contenttype/forms"/>
-  </ds:schemaRefs>
-</ds:datastoreItem>
+<file path=customXml/item3.xml><?xml version="1.0" encoding="utf-8"?>
+<p:properties xmlns:p="http://schemas.microsoft.com/office/2006/metadata/properties" xmlns:xsi="http://www.w3.org/2001/XMLSchema-instance" xmlns:pc="http://schemas.microsoft.com/office/infopath/2007/PartnerControls">
+  <documentManagement>
+    <TaxCatchAll xmlns="7dbd75cb-e23e-4bbb-9662-1ab6b6f3550b" xsi:nil="true"/>
+    <lcf76f155ced4ddcb4097134ff3c332f xmlns="dc24c30d-cbd4-4968-aaed-12d3995df8af">
+      <Terms xmlns="http://schemas.microsoft.com/office/infopath/2007/PartnerControls"/>
+    </lcf76f155ced4ddcb4097134ff3c332f>
+  </documentManagement>
+</p:properties>
 </file>
 
-<file path=customXml/itemProps3.xml><?xml version="1.0" encoding="utf-8"?>
+<file path=customXml/item4.xml><?xml version="1.0" encoding="utf-8"?>
+<b:Sources xmlns:b="http://schemas.openxmlformats.org/officeDocument/2006/bibliography" xmlns="http://schemas.openxmlformats.org/officeDocument/2006/bibliography" SelectedStyle="\APASixthEditionOfficeOnline.xsl" StyleName="APA" Version="6"/>
+</file>
+
+<file path=customXml/itemProps1.xml><?xml version="1.0" encoding="utf-8"?>
 <ds:datastoreItem xmlns:ds="http://schemas.openxmlformats.org/officeDocument/2006/customXml" ds:itemID="{EAEE37D9-83C3-4836-B2B5-2E782AF650FD}">
   <ds:schemaRefs>
     <ds:schemaRef ds:uri="http://schemas.microsoft.com/office/2006/metadata/contentType"/>
@@ -4996,4 +5007,31 @@
     <ds:schemaRef ds:uri="http://schemas.microsoft.com/internal/obd"/>
   </ds:schemaRefs>
 </ds:datastoreItem>
+</file>
+
+<file path=customXml/itemProps2.xml><?xml version="1.0" encoding="utf-8"?>
+<ds:datastoreItem xmlns:ds="http://schemas.openxmlformats.org/officeDocument/2006/customXml" ds:itemID="{1E505B68-5BE2-4F65-9D4E-7DC7DB12F4CC}">
+  <ds:schemaRefs>
+    <ds:schemaRef ds:uri="http://schemas.microsoft.com/sharepoint/v3/contenttype/forms"/>
+  </ds:schemaRefs>
+</ds:datastoreItem>
+</file>
+
+<file path=customXml/itemProps3.xml><?xml version="1.0" encoding="utf-8"?>
+<ds:datastoreItem xmlns:ds="http://schemas.openxmlformats.org/officeDocument/2006/customXml" ds:itemID="{6796437A-0DB8-4273-A275-D71E35AB8B0A}">
+  <ds:schemaRefs>
+    <ds:schemaRef ds:uri="http://schemas.microsoft.com/office/2006/metadata/properties"/>
+    <ds:schemaRef ds:uri="http://schemas.microsoft.com/office/infopath/2007/PartnerControls"/>
+    <ds:schemaRef ds:uri="7dbd75cb-e23e-4bbb-9662-1ab6b6f3550b"/>
+    <ds:schemaRef ds:uri="dc24c30d-cbd4-4968-aaed-12d3995df8af"/>
+  </ds:schemaRefs>
+</ds:datastoreItem>
+</file>
+
+<file path=customXml/itemProps4.xml><?xml version="1.0" encoding="utf-8"?>
+<ds:datastoreItem xmlns:ds="http://schemas.openxmlformats.org/officeDocument/2006/customXml" ds:itemID="{D9179DD7-531F-43D6-921E-15ECD7487455}">
+  <ds:schemaRefs>
+    <ds:schemaRef ds:uri="http://schemas.openxmlformats.org/officeDocument/2006/bibliography"/>
+  </ds:schemaRefs>
+</ds:datastoreItem>
 </file>
</xml_diff>